<commit_message>
refactor(linguagem): simplifica termos juridicos hermeticos substituindo gleba por terreno e grandes terrenos
</commit_message>
<xml_diff>
--- a/documentos_tcc/Artigo_Cientifico_TCC_IPTU_Curitiba_REVISADO.docx
+++ b/documentos_tcc/Artigo_Cientifico_TCC_IPTU_Curitiba_REVISADO.docx
@@ -364,7 +364,7 @@
           <w:b w:val="0"/>
           <w:i w:val="0"/>
         </w:rPr>
-        <w:t>O Estatuto da Cidade impõe prévia lei municipal delimitando a área no Plano Diretor, notificação pessoal averbada em Cartório de Registro de Imóveis e prazo razoável para cumprimento das etapas construtivas. Logo, quando a Fazenda Municipal de Curitiba aplica alíquota territorial máxima permanente a glebas providas de canteiro de obras ativo, burla por vias oblíquas os postulados do devido processo legal substantivo que regem as penalidades urbanísticas constitucionais.</w:t>
+        <w:t>O Estatuto da Cidade impõe prévia lei municipal delimitando a área no Plano Diretor, notificação pessoal averbada em Cartório de Registro de Imóveis e prazo razoável para cumprimento das etapas construtivas. Logo, quando a Fazenda Municipal de Curitiba aplica alíquota territorial máxima permanente a grandes terrenos providos de canteiro de obras ativo, burla por vias oblíquas os postulados do devido processo legal substantivo que regem as penalidades urbanísticas constitucionais.</w:t>
       </w:r>
     </w:p>
     <w:p>
@@ -502,7 +502,7 @@
           <w:b w:val="0"/>
           <w:i w:val="0"/>
         </w:rPr>
-        <w:t>Em terrenos urbanos de extensa metragem — característicos da Cidade Industrial de Curitiba (CIC), Pinheirinho e retroáreas ao longo do Contorno Sul e da BR-116 —, o valor venal do terreno atribuído pela nova PGV da LC n.º 136/2022 atinge dezenas de milhões de reais. A instalação de centros de triagem logística, armazéns metálicos leves e garagens estruturadas demanda ampla área livre e pavimentada. O valor de custo dessas construções frequentemente não atinge 5% do valor total da gleba, fazendo com que a SMFI lance IPTU territorial sobre todo o imóvel, gerando cobranças confiscatórias desprovidas de razoabilidade.</w:t>
+        <w:t>Em terrenos urbanos de extensa metragem — característicos da Cidade Industrial de Curitiba (CIC), Pinheirinho e retroáreas ao longo do Contorno Sul e da BR-116 —, o valor venal do terreno atribuído pela nova PGV da LC n.º 136/2022 atinge dezenas de milhões de reais. A instalação de centros de triagem logística, armazéns metálicos leves e garagens estruturadas demanda ampla área livre e pavimentada. O valor de custo dessas construções frequentemente não atinge 5% do valor total do terreno, fazendo com que a SMFI lance IPTU territorial sobre todo o imóvel, gerando cobranças confiscatórias desprovidas de razoabilidade.</w:t>
       </w:r>
     </w:p>
     <w:p>
@@ -882,7 +882,7 @@
               <w:rPr>
                 <w:sz w:val="19"/>
               </w:rPr>
-              <w:t>Rigidez aritmética; valor da construção menor que 5% do valor do terreno acarreta sobretaxa sobre toda a gleba.</w:t>
+              <w:t>Rigidez aritmética; valor da construção menor que 5% do valor do terreno acarreta sobretaxa sobre todo o terreno.</w:t>
             </w:r>
           </w:p>
         </w:tc>
@@ -1033,7 +1033,7 @@
           <w:i/>
           <w:sz w:val="24"/>
         </w:rPr>
-        <w:t>5.2 Proposição 2: Desdobro Fiscal e Tributação Proporcional das Construções em Grandes Glebas</w:t>
+        <w:t>5.2 Proposição 2: Desdobro Fiscal e Tributação Proporcional das Construções em Grandes Terrenos</w:t>
       </w:r>
     </w:p>
     <w:p>
@@ -1047,7 +1047,7 @@
           <w:b w:val="0"/>
           <w:i w:val="0"/>
         </w:rPr>
-        <w:t>Flexibilização dos critérios de enquadramento do artigo 42 da LC n.º 40/2001 para glebas extensas industriais e logísticas superiores a 5.000 m², autorizando a incidência predial sobre a fração de terreno afetada ao galpão e aos pátios operacionais, mantendo a tributação territorial tão somente sobre a área remanescente comprovadamente ociosa.</w:t>
+        <w:t>Flexibilização dos critérios de enquadramento do artigo 42 da LC n.º 40/2001 para grandes terrenos industriais e logísticas superiores a 5.000 m², autorizando a incidência predial sobre a fração de terreno afetada ao galpão e aos pátios operacionais, mantendo a tributação territorial tão somente sobre a área remanescente comprovadamente ociosa.</w:t>
       </w:r>
     </w:p>
     <w:p>

</xml_diff>